<commit_message>
Submission Comment: anticipate Hagan rebuttals (concede definitional sensitivity, harvest pressure, FIA sparsity, own thresholds; reconcile breadth vs under-prediction; isolate residual point) + position fuller manuscript
</commit_message>
<xml_diff>
--- a/Ecosphere_Comment_Hagan_SUBMISSION.docx
+++ b/Ecosphere_Comment_Hagan_SUBMISSION.docx
@@ -238,6 +238,20 @@
     </w:p>
     <w:p>
       <w:pPr>
+        <w:spacing w:after="0" w:line="480"/>
+        <w:jc w:val="left"/>
+      </w:pPr>
+      <w:r>
+        <w:rPr>
+          <w:rFonts w:ascii="Times New Roman" w:cs="Times New Roman" w:eastAsia="Times New Roman" w:hAnsi="Times New Roman"/>
+          <w:sz w:val="24"/>
+          <w:szCs w:val="24"/>
+        </w:rPr>
+        <w:t xml:space="preserve">The authors themselves emphasize that definitions vary and materially change the result, noting a case where relaxing the definition moved an estimate from 2.7 to 15%. I do not dispute that; the cross-method spread documented here is the same sensitivity expressed spatially and quantitatively. The concern is not that disagreement exists but that a single delivered map is used as an authoritative parcel-level layer without that sensitivity carried through to the dollar figures that depend on it.</w:t>
+      </w:r>
+    </w:p>
+    <w:p>
+      <w:pPr>
         <w:spacing w:after="0" w:before="240" w:line="480"/>
       </w:pPr>
       <w:r>
@@ -305,7 +319,7 @@
           <w:sz w:val="24"/>
           <w:szCs w:val="24"/>
         </w:rPr>
-        <w:t xml:space="preserve">The design-based series also addresses the loss premise. The map is motivated partly by rapid LSOG loss (reported at 1.37% per year overall and 2.19% on commercial timberland). That figure is a gross harvest flux: it counts mapped LSOG that later shows canopy removal in the Global Forest Watch record and does not net out ingrowth, and its threshold (&gt;30% canopy removal) sweeps in partial harvests that often retain late-successional structure. Over 2003-2024 older forest increased by every ground measure, with confidence intervals excluding zero (stand age &gt;= 120 yr at +0.065% of forestland per year; large-tree basal area at +0.17% per year), while total forestland was essentially flat; on private commercial timberland older forest is 3.3% and also rising. A stock that rises while about 2% of commercial land is cut each year implies that ingrowth exceeds removals, so the reported loss is a gross flux and the net flow is positive. Because the published map covers only the unorganized townships, I clipped the same design-based estimate to the map's exact area-of-interest polygon: within that footprint older forest is also increasing, not declining (stand age &gt;= 120 yr from 3.1 to 4.0%, large-tree basal area from 9.1 to 9.7%, all slopes positive with intervals excluding zero). The statewide trend is therefore not masking a within-townships loss.</w:t>
+        <w:t xml:space="preserve">The design-based series also addresses the loss premise. The map is motivated partly by rapid LSOG loss (reported at 1.37% per year overall and 2.19% on commercial timberland). That figure is a gross harvest flux: it counts mapped LSOG that later shows canopy removal in the Global Forest Watch record and does not net out ingrowth, and its threshold (&gt;30% canopy removal) sweeps in partial harvests that often retain late-successional structure. Over 2003-2024 older forest increased by every ground measure, with confidence intervals excluding zero (stand age &gt;= 120 yr at +0.065% of forestland per year; large-tree basal area at +0.17% per year), while total forestland was essentially flat; on private commercial timberland older forest is 3.3% and also rising. A stock that rises while about 2% of commercial land is cut each year implies that ingrowth exceeds removals, so the reported loss is a gross flux and the net flow is positive. Harvest is a genuine pressure on older forest and I do not dispute its importance; the narrow question is whether the net stock is declining, and over this period the unbiased inventory indicates it is not. Because the published map covers only the unorganized townships, I clipped the same design-based estimate to the map's exact area-of-interest polygon: within that footprint older forest is also increasing, not declining (stand age &gt;= 120 yr from 3.1 to 4.0%, large-tree basal area from 9.1 to 9.7%, all slopes positive with intervals excluding zero). The statewide trend is therefore not masking a within-townships loss.</w:t>
       </w:r>
     </w:p>
     <w:p>
@@ -334,7 +348,7 @@
           <w:sz w:val="24"/>
           <w:szCs w:val="24"/>
         </w:rPr>
-        <w:t xml:space="preserve">The constructive endpoint is a classification tied to what LSOG actually is and repeatable from transparent FIA measurements. I define true LSOG as forest satisfying four axes: live structure (large-tree basal area &gt;= 30 ft-squared/ac), dead wood (standing-dead basal area &gt;= 5 ft-squared/ac), compositional maturity (&gt;= 50% of live basal area in shade-tolerant, long-lived species), and temporal continuity (no recent cutting and natural stand origin). Each criterion is a deterministic function of FIA records, so the classification yields a design-based area with a confidence interval. Requiring more axes narrows the class sharply: 96% of Maine forestland meets at least one axis, 71% two, 30% three, and only 6.5% [5.6, 7.4] all four (Fig. 2), which sits sensibly between strict age-based old growth (3.9%) and broad canopy LSOG (about 20%). Live structure is the scarcest single axis (12.5%); the thresholds are illustrative and the dead-wood axis (snags only) and continuity axis (treatment codes) are permissive, so 6.5% is best read as an upper bound. Each axis is mappable with an explicit data source (LiDAR for live structure, the Landsat disturbance record for continuity, plots or imputation for dead wood and composition), so the definition has a path to a map calibrated to FIA. The requirement that several axes be met at once is what separates true LSOG from tall, big-treed, or merely mature forest, and is robust to the exact thresholds.</w:t>
+        <w:t xml:space="preserve">The constructive endpoint is a classification tied to what LSOG actually is and repeatable from transparent FIA measurements. I define true LSOG as forest satisfying four axes: live structure (large-tree basal area &gt;= 30 ft-squared/ac), dead wood (standing-dead basal area &gt;= 5 ft-squared/ac), compositional maturity (&gt;= 50% of live basal area in shade-tolerant, long-lived species), and temporal continuity (no recent cutting and natural stand origin). Each criterion is a deterministic function of FIA records, so the classification yields a design-based area with a confidence interval. Requiring more axes narrows the class sharply: 96% of Maine forestland meets at least one axis, 71% two, 30% three, and only 6.5% [5.6, 7.4] all four (Fig. 2), which sits sensibly between strict age-based old growth (3.9%) and broad canopy LSOG (about 20%). Live structure is the scarcest single axis (12.5%); the thresholds are illustrative and the dead-wood axis (snags only) and continuity axis (treatment codes) are permissive, so 6.5% is best read as an upper bound. I do not offer these cutoffs as a replacement bright line; the contribution is the multidimensional, reproducible framing and the reported interval, not a new threshold. Each axis is mappable with an explicit data source (LiDAR for live structure, the Landsat disturbance record for continuity, plots or imputation for dead wood and composition), so the definition has a path to a map calibrated to FIA. The requirement that several axes be met at once is what separates true LSOG from tall, big-treed, or merely mature forest, and is robust to the exact thresholds.</w:t>
       </w:r>
     </w:p>
     <w:p>
@@ -363,7 +377,21 @@
           <w:sz w:val="24"/>
           <w:szCs w:val="24"/>
         </w:rPr>
-        <w:t xml:space="preserve">Read as what it measures, tall large-tree forest, the classification is a valuable screening tool; read as a map of strict old growth to be protected at high cost, it counts much transitioning and late-successional forest. That breadth is a legitimate, objective-dependent choice rather than an error, but it must be read as such, and local errors run in both directions, with independent field truthing indicating under-classification in parts of western Maine even as the aggregate class is broad. The risk lies less in the map than in its use. Where mapped LSOG sits is also informative and two-sided: it falls disproportionately on high modeled harvest-probability ground (it is merchantable) yet also on steeper, more disturbance-prone terrain that raises cost and logistics (Appendix), so harvest risk is heterogeneous and parcel-specific rather than uniform. An influential but uncertain map may also change behavior ahead of policy; there are anecdotal reports that some landowners may be accelerating harvest in mapped LSOG in anticipation of regulation, which, if real, would be a further reason to attach uncertainty and verify before designation.</w:t>
+        <w:t xml:space="preserve">Read as what it measures, tall large-tree forest, the classification is a valuable screening tool; read as a map of strict old growth to be protected at high cost, it counts much transitioning and late-successional forest. That breadth is a legitimate, objective-dependent choice rather than an error, but it must be read as such, and local errors run in both directions, with independent field truthing indicating under-classification in parts of western Maine even as the aggregate class is broad. These are different quantities, a broad class boundary and local omission, and both can hold at once, so noting the map breadth is not a claim that it never misses true old growth. The risk lies less in the map than in its use. Where mapped LSOG sits is also informative and two-sided: it falls disproportionately on high modeled harvest-probability ground (it is merchantable) yet also on steeper, more disturbance-prone terrain that raises cost and logistics (Appendix), so harvest risk is heterogeneous and parcel-specific rather than uniform. An influential but uncertain map may also change behavior ahead of policy; there are anecdotal reports that some landowners may be accelerating harvest in mapped LSOG in anticipation of regulation, which, if real, would be a further reason to attach uncertainty and verify before designation.</w:t>
+      </w:r>
+    </w:p>
+    <w:p>
+      <w:pPr>
+        <w:spacing w:after="0" w:line="480"/>
+        <w:jc w:val="left"/>
+      </w:pPr>
+      <w:r>
+        <w:rPr>
+          <w:rFonts w:ascii="Times New Roman" w:cs="Times New Roman" w:eastAsia="Times New Roman" w:hAnsi="Times New Roman"/>
+          <w:sz w:val="24"/>
+          <w:szCs w:val="24"/>
+        </w:rPr>
+        <w:t xml:space="preserve">To be clear about scope, several likely objections are ones I largely share. That LSOG definitions vary and shift the totals is the authors’ own point rather than a counter to it; that airborne LiDAR cannot fully resolve old-growth structure is stated in their Limitations; that FIA is too sparse to locate individual patches is true, which is exactly why a verified map and the inventory are complementary; and that the four-axis thresholds above are themselves choices is conceded. None of these is the issue. The issue is narrower: a single, unvalidated map, whatever its merits, is being used to compute and rank parcel-level expenditures without an accuracy assessment, an independent cross-check, or a reported interval, and those three additions, not a different map, are what the decision requires.</w:t>
       </w:r>
     </w:p>
     <w:p>
@@ -406,7 +434,7 @@
           <w:sz w:val="24"/>
           <w:szCs w:val="24"/>
         </w:rPr>
-        <w:t xml:space="preserve">I thank the authors of the original study for archiving their data and code, which made this Comment possible, and colleagues at the Center for Research on Sustainable Forests for discussion. All analysis code and derived products are archived (Zenodo).</w:t>
+        <w:t xml:space="preserve">I thank the authors of the original study for archiving their data and code, which made this Comment possible, and colleagues at the Center for Research on Sustainable Forests for discussion. All analysis code and derived products are archived (Zenodo). A fuller treatment that develops the accuracy assessment, the multidimensional classification, and the multi-map ensemble in depth is in preparation; this Comment is deliberately limited to the points most relevant to the immediate use of the published map.</w:t>
       </w:r>
     </w:p>
     <w:p>

</xml_diff>

<commit_message>
Submission: figures as 300-dpi ESA TIFFs (Fig1/2); reframe supporting material as Supporting Information (outside page limit) not appendices
</commit_message>
<xml_diff>
--- a/Ecosphere_Comment_Hagan_SUBMISSION.docx
+++ b/Ecosphere_Comment_Hagan_SUBMISSION.docx
@@ -176,7 +176,7 @@
           <w:sz w:val="24"/>
           <w:szCs w:val="24"/>
         </w:rPr>
-        <w:t xml:space="preserve">The concern is narrow and methodological. The map is now being used quantitatively, to prioritize roughly $200-300 million in conservation funding under Maine's LD 1529 (Thompson et al. 2026), at a scale to which its stated uncertainties were never propagated. Fitness at those stakes depends on three properties the original analysis did not report: agreement with independent maps, agreement with unbiased ground inventory, and a confidence interval on the quantities taken from the map. This Comment supplies all three using the authors' own data and public inventory over the same area, and then sketches a constructive, repeatable alternative. The aim is to strengthen, not diminish, the use of LiDAR for this purpose. Supporting analyses (regional context, current protection, a multi-method ensemble prototype, a Landsat continuity layer, harvest-probability and terrain drivers, and a carbon comparison) are summarized in the Appendices.</w:t>
+        <w:t xml:space="preserve">The concern is narrow and methodological. The map is now being used quantitatively, to prioritize roughly $200-300 million in conservation funding under Maine's LD 1529 (Thompson et al. 2026), at a scale to which its stated uncertainties were never propagated. Fitness at those stakes depends on three properties the original analysis did not report: agreement with independent maps, agreement with unbiased ground inventory, and a confidence interval on the quantities taken from the map. This Comment supplies all three using the authors' own data and public inventory over the same area, and then sketches a constructive, repeatable alternative. The aim is to strengthen, not diminish, the use of LiDAR for this purpose. Supporting analyses (regional context, current protection, a multi-method ensemble prototype, a Landsat continuity layer, harvest-probability and terrain drivers, and a carbon comparison) are provided as Supporting Information (Ecological Archives), which falls outside the manuscript page limit.</w:t>
       </w:r>
     </w:p>
     <w:p>
@@ -219,7 +219,7 @@
           <w:sz w:val="24"/>
           <w:szCs w:val="24"/>
         </w:rPr>
-        <w:t xml:space="preserve">The decisive test for policy use is whether independent, equally defensible operationalizations agree on the landscape. I compared three wall-to-wall classifications over the same area on a common 100 m grid: the reproduced Hagan LiDAR classifier; an FIA field-structure class predicted from Potapov (GEDI-calibrated) canopy height (Potapov et al. 2021); and the USFS TreeMap imputation of FIA structural class. They disagree substantially (Table 1, Fig. 1). Any-LSOG covers 21.9% of the area under the reproduced Hagan classifier (close to the authors' reported 19.7%), 14.0% under the canopy-height model, and 7.8% under TreeMap, a 2.5- to 2.8-fold range. The Hagan and canopy-height maps overlap on only about 21% of the hectares either flags (Cohen's kappa 0.21); across all three methods only 21% of the flagged footprint is agreed by all three, and top-priority protected sets selected by different maps overlap on only 16-30% of the ground. Part of any pixel-level disagreement reflects geolocation error among products (spaceborne GEDI alone carries about 10 m; Shannon et al. 2024), which is why I emphasize disagreement in total amount, aggregate to 8 km hexagons in the Appendix, and treat the design-based FIA estimate as the reference. A 20-seed ensemble bounds the reproduced area at 4.23% (SD 0.06), so the disagreement is genuine, not an artifact of reproduction. None of these products is ground truth, including the two I built; the point is that credible operationalizations of the same target disagree by this much, which is the property a single-map prioritization must reckon with.</w:t>
+        <w:t xml:space="preserve">The decisive test for policy use is whether independent, equally defensible operationalizations agree on the landscape. I compared three wall-to-wall classifications over the same area on a common 100 m grid: the reproduced Hagan LiDAR classifier; an FIA field-structure class predicted from Potapov (GEDI-calibrated) canopy height (Potapov et al. 2021); and the USFS TreeMap imputation of FIA structural class. They disagree substantially (Table 1, Fig. 1). Any-LSOG covers 21.9% of the area under the reproduced Hagan classifier (close to the authors' reported 19.7%), 14.0% under the canopy-height model, and 7.8% under TreeMap, a 2.5- to 2.8-fold range. The Hagan and canopy-height maps overlap on only about 21% of the hectares either flags (Cohen's kappa 0.21); across all three methods only 21% of the flagged footprint is agreed by all three, and top-priority protected sets selected by different maps overlap on only 16-30% of the ground. Part of any pixel-level disagreement reflects geolocation error among products (spaceborne GEDI alone carries about 10 m; Shannon et al. 2024), which is why I emphasize disagreement in total amount, aggregate to 8 km hexagons (Supporting Information), and treat the design-based FIA estimate as the reference. A 20-seed ensemble bounds the reproduced area at 4.23% (SD 0.06), so the disagreement is genuine, not an artifact of reproduction. None of these products is ground truth, including the two I built; the point is that credible operationalizations of the same target disagree by this much, which is the property a single-map prioritization must reckon with.</w:t>
       </w:r>
     </w:p>
     <w:p>
@@ -377,7 +377,7 @@
           <w:sz w:val="24"/>
           <w:szCs w:val="24"/>
         </w:rPr>
-        <w:t xml:space="preserve">Read as what it measures, tall large-tree forest, the classification is a valuable screening tool; read as a map of strict old growth to be protected at high cost, it counts much transitioning and late-successional forest. That breadth is a legitimate, objective-dependent choice rather than an error, but it must be read as such, and local errors run in both directions, with independent field truthing indicating under-classification in parts of western Maine even as the aggregate class is broad. These are different quantities, a broad class boundary and local omission, and both can hold at once, so noting the map breadth is not a claim that it never misses true old growth. The risk lies less in the map than in its use. Where mapped LSOG sits is also informative and two-sided: it falls disproportionately on high modeled harvest-probability ground (it is merchantable) yet also on steeper, more disturbance-prone terrain that raises cost and logistics (Appendix), so harvest risk is heterogeneous and parcel-specific rather than uniform. An influential but uncertain map may also change behavior ahead of policy; there are anecdotal reports that some landowners may be accelerating harvest in mapped LSOG in anticipation of regulation, which, if real, would be a further reason to attach uncertainty and verify before designation.</w:t>
+        <w:t xml:space="preserve">Read as what it measures, tall large-tree forest, the classification is a valuable screening tool; read as a map of strict old growth to be protected at high cost, it counts much transitioning and late-successional forest. That breadth is a legitimate, objective-dependent choice rather than an error, but it must be read as such, and local errors run in both directions, with independent field truthing indicating under-classification in parts of western Maine even as the aggregate class is broad. These are different quantities, a broad class boundary and local omission, and both can hold at once, so noting the map breadth is not a claim that it never misses true old growth. The risk lies less in the map than in its use. Where mapped LSOG sits is also informative and two-sided: it falls disproportionately on high modeled harvest-probability ground (it is merchantable) yet also on steeper, more disturbance-prone terrain that raises cost and logistics (Supporting Information), so harvest risk is heterogeneous and parcel-specific rather than uniform. An influential but uncertain map may also change behavior ahead of policy; there are anecdotal reports that some landowners may be accelerating harvest in mapped LSOG in anticipation of regulation, which, if real, would be a further reason to attach uncertainty and verify before designation.</w:t>
       </w:r>
     </w:p>
     <w:p>
@@ -1912,7 +1912,7 @@
           <w:sz w:val="20"/>
           <w:szCs w:val="20"/>
         </w:rPr>
-        <w:t xml:space="preserve">Fig. 1 (separate file at submission).</w:t>
+        <w:t xml:space="preserve">Fig. 1 (supplied as separate 300-dpi TIFF: WeiskittelComment_Fig1.tif).</w:t>
       </w:r>
     </w:p>
     <w:p>
@@ -1925,7 +1925,7 @@
           <wp:inline distT="0" distB="0" distL="0" distR="0">
             <wp:extent cx="4095750" cy="5410200"/>
             <wp:effectExtent t="0" r="0" b="0" l="0"/>
-            <wp:docPr id="1" name="Fig. 1 (separate file at submission)." descr="Fig. 1 (separate file at submission)." title="Fig. 1 (separate file at submission)."/>
+            <wp:docPr id="1" name="Fig. 1 (supplied as separate 300-dpi TIFF: WeiskittelComment_Fig1.tif)." descr="Fig. 1 (supplied as separate 300-dpi TIFF: WeiskittelComment_Fig1.tif)." title="Fig. 1 (supplied as separate 300-dpi TIFF: WeiskittelComment_Fig1.tif)."/>
             <wp:cNvGraphicFramePr>
               <a:graphicFrameLocks xmlns:a="http://schemas.openxmlformats.org/drawingml/2006/main" noChangeAspect="1"/>
             </wp:cNvGraphicFramePr>
@@ -1978,7 +1978,7 @@
           <w:sz w:val="20"/>
           <w:szCs w:val="20"/>
         </w:rPr>
-        <w:t xml:space="preserve">Fig. 2 (separate file at submission).</w:t>
+        <w:t xml:space="preserve">Fig. 2 (supplied as separate 300-dpi TIFF: WeiskittelComment_Fig2.tif).</w:t>
       </w:r>
     </w:p>
     <w:p>
@@ -1991,7 +1991,7 @@
           <wp:inline distT="0" distB="0" distL="0" distR="0">
             <wp:extent cx="4095750" cy="4467225"/>
             <wp:effectExtent t="0" r="0" b="0" l="0"/>
-            <wp:docPr id="1" name="Fig. 2 (separate file at submission)." descr="Fig. 2 (separate file at submission)." title="Fig. 2 (separate file at submission)."/>
+            <wp:docPr id="1" name="Fig. 2 (supplied as separate 300-dpi TIFF: WeiskittelComment_Fig2.tif)." descr="Fig. 2 (supplied as separate 300-dpi TIFF: WeiskittelComment_Fig2.tif)." title="Fig. 2 (supplied as separate 300-dpi TIFF: WeiskittelComment_Fig2.tif)."/>
             <wp:cNvGraphicFramePr>
               <a:graphicFrameLocks xmlns:a="http://schemas.openxmlformats.org/drawingml/2006/main" noChangeAspect="1"/>
             </wp:cNvGraphicFramePr>

</xml_diff>

<commit_message>
Submission expanded to ~14pp: synthesis how-much-LSOG centerpiece (Fig2), trend (Fig3), drivers section (Fig5), continuity; tables to visuals; 5 ESA TIFFs
</commit_message>
<xml_diff>
--- a/Ecosphere_Comment_Hagan_SUBMISSION.docx
+++ b/Ecosphere_Comment_Hagan_SUBMISSION.docx
@@ -305,7 +305,7 @@
           <w:sz w:val="24"/>
           <w:szCs w:val="24"/>
         </w:rPr>
-        <w:t xml:space="preserve">The USDA Forest Inventory and Analysis (FIA) program measures forest structure under a probability sample, permitting design-based estimates with sampling-error variance (Stanke et al. 2020). FIA is unbiased for area but, at its plot density, imprecise; it cannot by itself locate the rare small patches a wall-to-wall map can flag, so inventory and map are complementary rather than rival. Using rFIA over all Maine inventory years, older forest by transparent ground criteria is (2024, 95% CI): stand age &gt;= 120 yr, 3.9% [3.3, 4.6] of forestland; and large-tree basal area (trees &gt;= 40 cm dbh exceeding 30 ft-squared/ac), 12.5% [11.4, 13.7] (Table 3). The point estimate brackets the authors' published LS+OGL figure of 3.9%, which is reassuring, but that figure was reported without an interval; the unbiased ground baseline places it in a range of roughly 3.3-4.6%, and that uncertainty is exactly what a $200-300 million prioritization should carry.</w:t>
+        <w:t xml:space="preserve">The USDA Forest Inventory and Analysis (FIA) program measures forest structure under a probability sample, permitting design-based estimates with sampling-error variance (Stanke et al. 2020). FIA is unbiased for area but, at its plot density, imprecise; it cannot by itself locate the rare small patches a wall-to-wall map can flag, so inventory and map are complementary rather than rival. Using rFIA over all Maine inventory years, older forest by transparent ground criteria is (2024, 95% CI): stand age &gt;= 120 yr, 3.9% [3.3, 4.6] of forestland; and large-tree basal area (trees &gt;= 40 cm dbh exceeding 30 ft-squared/ac), 12.5% [11.4, 13.7]. The point estimate brackets the authors' published LS+OGL figure of 3.9%, which is reassuring, but that figure was reported without an interval; the unbiased ground baseline places it in a range of roughly 3.3-4.6%, and that uncertainty is exactly what a $200-300 million prioritization should carry.</w:t>
       </w:r>
     </w:p>
     <w:p>
@@ -319,7 +319,7 @@
           <w:sz w:val="24"/>
           <w:szCs w:val="24"/>
         </w:rPr>
-        <w:t xml:space="preserve">The design-based series also addresses the loss premise. The map is motivated partly by rapid LSOG loss (reported at 1.37% per year overall and 2.19% on commercial timberland). That figure is a gross harvest flux: it counts mapped LSOG that later shows canopy removal in the Global Forest Watch record and does not net out ingrowth, and its threshold (&gt;30% canopy removal) sweeps in partial harvests that often retain late-successional structure. Over 2003-2024 older forest increased by every ground measure, with confidence intervals excluding zero (stand age &gt;= 120 yr at +0.065% of forestland per year; large-tree basal area at +0.17% per year), while total forestland was essentially flat; on private commercial timberland older forest is 3.3% and also rising. A stock that rises while about 2% of commercial land is cut each year implies that ingrowth exceeds removals, so the reported loss is a gross flux and the net flow is positive. Harvest is a genuine pressure on older forest and I do not dispute its importance; the narrow question is whether the net stock is declining, and over this period the unbiased inventory indicates it is not. Because the published map covers only the unorganized townships, I clipped the same design-based estimate to the map's exact area-of-interest polygon: within that footprint older forest is also increasing, not declining (stand age &gt;= 120 yr from 3.1 to 4.0%, large-tree basal area from 9.1 to 9.7%, all slopes positive with intervals excluding zero). The statewide trend is therefore not masking a within-townships loss.</w:t>
+        <w:t xml:space="preserve">The design-based series also addresses the loss premise. The map is motivated partly by rapid LSOG loss (reported at 1.37% per year overall and 2.19% on commercial timberland). That figure is a gross harvest flux: it counts mapped LSOG that later shows canopy removal in the Global Forest Watch record and does not net out ingrowth, and its threshold (&gt;30% canopy removal) sweeps in partial harvests that often retain late-successional structure. Over 2003-2024 older forest increased by every ground measure, with confidence intervals excluding zero (stand age &gt;= 120 yr at +0.065% of forestland per year; large-tree basal area at +0.17% per year), while total forestland was essentially flat (Fig. 3); on private commercial timberland older forest is 3.3% and also rising. A stock that rises while about 2% of commercial land is cut each year implies that ingrowth exceeds removals, so the reported loss is a gross flux and the net flow is positive. Harvest is a genuine pressure on older forest and I do not dispute its importance; the narrow question is whether the net stock is declining, and over this period the unbiased inventory indicates it is not. Because the published map covers only the unorganized townships, I clipped the same design-based estimate to the map's exact area-of-interest polygon: within that footprint older forest is also increasing, not declining (stand age &gt;= 120 yr from 3.1 to 4.0%, large-tree basal area from 9.1 to 9.7%, all slopes positive with intervals excluding zero). The statewide trend is therefore not masking a within-townships loss.</w:t>
       </w:r>
     </w:p>
     <w:p>
@@ -334,7 +334,7 @@
           <w:sz w:val="24"/>
           <w:szCs w:val="24"/>
         </w:rPr>
-        <w:t xml:space="preserve">Toward a repeatable classification of true LSOG</w:t>
+        <w:t xml:space="preserve">Beyond the unorganized townships</w:t>
       </w:r>
     </w:p>
     <w:p>
@@ -348,7 +348,7 @@
           <w:sz w:val="24"/>
           <w:szCs w:val="24"/>
         </w:rPr>
-        <w:t xml:space="preserve">The constructive endpoint is a classification tied to what LSOG actually is and repeatable from transparent FIA measurements. I define true LSOG as forest satisfying four axes: live structure (large-tree basal area &gt;= 30 ft-squared/ac), dead wood (standing-dead basal area &gt;= 5 ft-squared/ac), compositional maturity (&gt;= 50% of live basal area in shade-tolerant, long-lived species), and temporal continuity (no recent cutting and natural stand origin). Each criterion is a deterministic function of FIA records, so the classification yields a design-based area with a confidence interval. Requiring more axes narrows the class sharply: 96% of Maine forestland meets at least one axis, 71% two, 30% three, and only 6.5% [5.6, 7.4] all four (Fig. 2), which sits sensibly between strict age-based old growth (3.9%) and broad canopy LSOG (about 20%). Live structure is the scarcest single axis (12.5%); the thresholds are illustrative and the dead-wood axis (snags only) and continuity axis (treatment codes) are permissive, so 6.5% is best read as an upper bound. I do not offer these cutoffs as a replacement bright line; the contribution is the multidimensional, reproducible framing and the reported interval, not a new threshold. Each axis is mappable with an explicit data source (LiDAR for live structure, the Landsat disturbance record for continuity, plots or imputation for dead wood and composition), so the definition has a path to a map calibrated to FIA. The requirement that several axes be met at once is what separates true LSOG from tall, big-treed, or merely mature forest, and is robust to the exact thresholds.</w:t>
+        <w:t xml:space="preserve">Two further checks bound the claim, both detailed in the Supporting Information. First, the increase is regional rather than a Maine artifact: design-based older forest is stable to increasing in every New England state over the inventory record, so the trajectory in the unorganized townships is consistent with the wider region. Second, the resource is overwhelmingly unprotected: only about 12% of Maine's older forest is on reserved land, almost all of it public, while the large majority sits on private commercial timberland, where it is nonetheless rising. A single-date classification is also a snapshot that cannot credit the LSOG that ongoing conservation and natural ingrowth will produce; the authors note that the transitioning class (about 16% of the area) is the pipeline that becomes late-successional over the coming decades, so a map reporting current loss understates the trajectory that easements and set-asides are deliberately building.</w:t>
       </w:r>
     </w:p>
     <w:p>
@@ -363,6 +363,93 @@
           <w:sz w:val="24"/>
           <w:szCs w:val="24"/>
         </w:rPr>
+        <w:t xml:space="preserve">Toward a repeatable classification of true LSOG</w:t>
+      </w:r>
+    </w:p>
+    <w:p>
+      <w:pPr>
+        <w:spacing w:after="0" w:line="480"/>
+        <w:jc w:val="left"/>
+      </w:pPr>
+      <w:r>
+        <w:rPr>
+          <w:rFonts w:ascii="Times New Roman" w:cs="Times New Roman" w:eastAsia="Times New Roman" w:hAnsi="Times New Roman"/>
+          <w:sz w:val="24"/>
+          <w:szCs w:val="24"/>
+        </w:rPr>
+        <w:t xml:space="preserve">The constructive endpoint is a classification tied to what LSOG actually is and repeatable from transparent FIA measurements. I define true LSOG as forest satisfying four axes: live structure (large-tree basal area &gt;= 30 ft-squared/ac), dead wood (standing-dead basal area &gt;= 5 ft-squared/ac), compositional maturity (&gt;= 50% of live basal area in shade-tolerant, long-lived species), and temporal continuity (no recent cutting and natural stand origin). Each criterion is a deterministic function of FIA records, so the classification yields a design-based area with a confidence interval. Requiring more axes narrows the class sharply: 96% of Maine forestland meets at least one axis, 71% two, 30% three, and only 6.5% [5.6, 7.4] all four (Fig. 4), which sits sensibly between strict age-based old growth (3.9%) and broad canopy LSOG (about 20%). Live structure is the scarcest single axis (12.5%); the thresholds are illustrative and the dead-wood axis (snags only) and continuity axis (treatment codes) are permissive, so 6.5% is best read as an upper bound. I do not offer these cutoffs as a replacement bright line; the contribution is the multidimensional, reproducible framing and the reported interval, not a new threshold. Each axis is mappable with an explicit data source (LiDAR for live structure, the Landsat disturbance record for continuity, plots or imputation for dead wood and composition), so the definition has a path to a map calibrated to FIA. As a first demonstration of the continuity axis, a Landsat disturbance record shows that about a quarter of the canopy-mapped LSOG has experienced stand-replacing disturbance since 2001 and would fail a strict continuity test (Supporting Information). The requirement that several axes be met at once is what separates true LSOG from tall, big-treed, or merely mature forest, and is robust to the exact thresholds.</w:t>
+      </w:r>
+    </w:p>
+    <w:p>
+      <w:pPr>
+        <w:spacing w:after="0" w:before="240" w:line="480"/>
+      </w:pPr>
+      <w:r>
+        <w:rPr>
+          <w:rFonts w:ascii="Times New Roman" w:cs="Times New Roman" w:eastAsia="Times New Roman" w:hAnsi="Times New Roman"/>
+          <w:b/>
+          <w:bCs/>
+          <w:sz w:val="24"/>
+          <w:szCs w:val="24"/>
+        </w:rPr>
+        <w:t xml:space="preserve">How much LSOG, then?</w:t>
+      </w:r>
+    </w:p>
+    <w:p>
+      <w:pPr>
+        <w:spacing w:after="0" w:line="480"/>
+        <w:jc w:val="left"/>
+      </w:pPr>
+      <w:r>
+        <w:rPr>
+          <w:rFonts w:ascii="Times New Roman" w:cs="Times New Roman" w:eastAsia="Times New Roman" w:hAnsi="Times New Roman"/>
+          <w:sz w:val="24"/>
+          <w:szCs w:val="24"/>
+        </w:rPr>
+        <w:t xml:space="preserve">The estimates assembled here answer the question that drives the policy: for the same forest, how much is LSOG? They span roughly 4% to 22% depending on the definition (Fig. 2), about a 5.6-fold range. Strict age-based old growth and the reproduced strict canopy class sit near 4%; the four-axis true-LSOG estimate is 6.5% [5.6, 7.4]; FIA large-tree structure is 12.5% [11.4, 13.7]; and the broad airborne-LiDAR any-LSOG class is about 20%. The design-based figures carry confidence intervals; the remote-sensing class areas do not. The honest reporting unit for a prioritization is this range with its definitions attached, not a single headline number, because each definition selects a different set of hectares and a different cost.</w:t>
+      </w:r>
+    </w:p>
+    <w:p>
+      <w:pPr>
+        <w:spacing w:after="0" w:before="240" w:line="480"/>
+      </w:pPr>
+      <w:r>
+        <w:rPr>
+          <w:rFonts w:ascii="Times New Roman" w:cs="Times New Roman" w:eastAsia="Times New Roman" w:hAnsi="Times New Roman"/>
+          <w:b/>
+          <w:bCs/>
+          <w:sz w:val="24"/>
+          <w:szCs w:val="24"/>
+        </w:rPr>
+        <w:t xml:space="preserve">Where LSOG sits on the landscape</w:t>
+      </w:r>
+    </w:p>
+    <w:p>
+      <w:pPr>
+        <w:spacing w:after="0" w:line="480"/>
+        <w:jc w:val="left"/>
+      </w:pPr>
+      <w:r>
+        <w:rPr>
+          <w:rFonts w:ascii="Times New Roman" w:cs="Times New Roman" w:eastAsia="Times New Roman" w:hAnsi="Times New Roman"/>
+          <w:sz w:val="24"/>
+          <w:szCs w:val="24"/>
+        </w:rPr>
+        <w:t xml:space="preserve">Where the mapped LSOG falls is itself informative about risk, and it is two-sided (Fig. 5). Overlaying the airborne map with a CONUS harvest-probability model and the satellite disturbance record (n = 3.8 million pixels), mapped LSOG concentrates on high modeled harvest-probability ground: the mapped-LSOG share rises from 13% in the lowest harvest-probability tercile to 34% in the highest, because the structure that reads as LSOG is also what makes a stand merchantable. Yet it also sits on more difficult terrain, with the share rising from 12% on the gentlest ground to 37% on the steepest and from 17% to 35% across the disturbance gradient, so the same stands are attractive to harvest but costlier to reach and operate. Harvest risk is therefore heterogeneous and parcel-specific rather than uniform. An influential but uncertain map may also change behavior ahead of policy: there are anecdotal reports that some landowners may be accelerating harvest in mapped LSOG in anticipation of regulation, which, if real, would be a further reason to attach uncertainty and field-verify before any stand is designated.</w:t>
+      </w:r>
+    </w:p>
+    <w:p>
+      <w:pPr>
+        <w:spacing w:after="0" w:before="240" w:line="480"/>
+      </w:pPr>
+      <w:r>
+        <w:rPr>
+          <w:rFonts w:ascii="Times New Roman" w:cs="Times New Roman" w:eastAsia="Times New Roman" w:hAnsi="Times New Roman"/>
+          <w:b/>
+          <w:bCs/>
+          <w:sz w:val="24"/>
+          <w:szCs w:val="24"/>
+        </w:rPr>
         <w:t xml:space="preserve">Implications and recommendations</w:t>
       </w:r>
     </w:p>
@@ -377,7 +464,7 @@
           <w:sz w:val="24"/>
           <w:szCs w:val="24"/>
         </w:rPr>
-        <w:t xml:space="preserve">Read as what it measures, tall large-tree forest, the classification is a valuable screening tool; read as a map of strict old growth to be protected at high cost, it counts much transitioning and late-successional forest. That breadth is a legitimate, objective-dependent choice rather than an error, but it must be read as such, and local errors run in both directions, with independent field truthing indicating under-classification in parts of western Maine even as the aggregate class is broad. These are different quantities, a broad class boundary and local omission, and both can hold at once, so noting the map breadth is not a claim that it never misses true old growth. The risk lies less in the map than in its use. Where mapped LSOG sits is also informative and two-sided: it falls disproportionately on high modeled harvest-probability ground (it is merchantable) yet also on steeper, more disturbance-prone terrain that raises cost and logistics (Supporting Information), so harvest risk is heterogeneous and parcel-specific rather than uniform. An influential but uncertain map may also change behavior ahead of policy; there are anecdotal reports that some landowners may be accelerating harvest in mapped LSOG in anticipation of regulation, which, if real, would be a further reason to attach uncertainty and verify before designation.</w:t>
+        <w:t xml:space="preserve">Read as what it measures, tall large-tree forest, the classification is a valuable screening tool; read as a map of strict old growth to be protected at high cost, it counts much transitioning and late-successional forest. That breadth is a legitimate, objective-dependent choice rather than an error, but it must be read as such, and local errors run in both directions, with independent field truthing indicating under-classification in parts of western Maine even as the aggregate class is broad. These are different quantities, a broad class boundary and local omission, and both can hold at once, so noting the map breadth is not a claim that it never misses true old growth. The risk lies less in the map than in its use.</w:t>
       </w:r>
     </w:p>
     <w:p>
@@ -1497,357 +1584,6 @@
       </w:tr>
     </w:tbl>
     <w:p>
-      <w:pPr>
-        <w:spacing w:after="0" w:line="480"/>
-      </w:pPr>
-      <w:r>
-        <w:rPr>
-          <w:rFonts w:ascii="Times New Roman" w:cs="Times New Roman" w:eastAsia="Times New Roman" w:hAnsi="Times New Roman"/>
-          <w:sz w:val="24"/>
-          <w:szCs w:val="24"/>
-        </w:rPr>
-        <w:t xml:space="preserve"/>
-      </w:r>
-    </w:p>
-    <w:p>
-      <w:pPr>
-        <w:spacing w:after="0" w:line="480"/>
-      </w:pPr>
-      <w:r>
-        <w:rPr>
-          <w:rFonts w:ascii="Times New Roman" w:cs="Times New Roman" w:eastAsia="Times New Roman" w:hAnsi="Times New Roman"/>
-          <w:sz w:val="24"/>
-          <w:szCs w:val="24"/>
-        </w:rPr>
-        <w:t xml:space="preserve">Table 3. FIA design-based older-forest area (2024) with 95% CI and 2003-2024 trend, statewide. Both measures are increasing.</w:t>
-      </w:r>
-    </w:p>
-    <w:p>
-      <w:pPr>
-        <w:spacing w:after="0" w:line="480"/>
-      </w:pPr>
-      <w:r>
-        <w:rPr>
-          <w:rFonts w:ascii="Times New Roman" w:cs="Times New Roman" w:eastAsia="Times New Roman" w:hAnsi="Times New Roman"/>
-          <w:sz w:val="24"/>
-          <w:szCs w:val="24"/>
-        </w:rPr>
-        <w:t xml:space="preserve"/>
-      </w:r>
-    </w:p>
-    <w:tbl>
-      <w:tblPr>
-        <w:tblW w:type="dxa" w:w="9360"/>
-        <w:tblBorders>
-          <w:top w:val="single" w:color="auto" w:sz="4"/>
-          <w:left w:val="single" w:color="auto" w:sz="4"/>
-          <w:bottom w:val="single" w:color="auto" w:sz="4"/>
-          <w:right w:val="single" w:color="auto" w:sz="4"/>
-          <w:insideH w:val="single" w:color="auto" w:sz="4"/>
-          <w:insideV w:val="single" w:color="auto" w:sz="4"/>
-        </w:tblBorders>
-      </w:tblPr>
-      <w:tblGrid>
-        <w:gridCol w:w="4560"/>
-        <w:gridCol w:w="2400"/>
-        <w:gridCol w:w="2400"/>
-      </w:tblGrid>
-      <w:tr>
-        <w:tc>
-          <w:tcPr>
-            <w:tcW w:type="dxa" w:w="4560"/>
-            <w:tcBorders>
-              <w:top w:val="single" w:color="000000" w:sz="1"/>
-              <w:left w:val="single" w:color="000000" w:sz="1"/>
-              <w:bottom w:val="single" w:color="000000" w:sz="1"/>
-              <w:right w:val="single" w:color="000000" w:sz="1"/>
-            </w:tcBorders>
-            <w:tcMar>
-              <w:top w:type="dxa" w:w="40"/>
-              <w:left w:type="dxa" w:w="90"/>
-              <w:bottom w:type="dxa" w:w="40"/>
-              <w:right w:type="dxa" w:w="90"/>
-            </w:tcMar>
-          </w:tcPr>
-          <w:p>
-            <w:pPr>
-              <w:spacing w:line="240"/>
-            </w:pPr>
-            <w:r>
-              <w:rPr>
-                <w:rFonts w:ascii="Times New Roman" w:cs="Times New Roman" w:eastAsia="Times New Roman" w:hAnsi="Times New Roman"/>
-                <w:b/>
-                <w:bCs/>
-                <w:sz w:val="20"/>
-                <w:szCs w:val="20"/>
-              </w:rPr>
-              <w:t xml:space="preserve">Domain (ground criterion)</w:t>
-            </w:r>
-          </w:p>
-        </w:tc>
-        <w:tc>
-          <w:tcPr>
-            <w:tcW w:type="dxa" w:w="2400"/>
-            <w:tcBorders>
-              <w:top w:val="single" w:color="000000" w:sz="1"/>
-              <w:left w:val="single" w:color="000000" w:sz="1"/>
-              <w:bottom w:val="single" w:color="000000" w:sz="1"/>
-              <w:right w:val="single" w:color="000000" w:sz="1"/>
-            </w:tcBorders>
-            <w:tcMar>
-              <w:top w:type="dxa" w:w="40"/>
-              <w:left w:type="dxa" w:w="90"/>
-              <w:bottom w:type="dxa" w:w="40"/>
-              <w:right w:type="dxa" w:w="90"/>
-            </w:tcMar>
-          </w:tcPr>
-          <w:p>
-            <w:pPr>
-              <w:spacing w:line="240"/>
-            </w:pPr>
-            <w:r>
-              <w:rPr>
-                <w:rFonts w:ascii="Times New Roman" w:cs="Times New Roman" w:eastAsia="Times New Roman" w:hAnsi="Times New Roman"/>
-                <w:b/>
-                <w:bCs/>
-                <w:sz w:val="20"/>
-                <w:szCs w:val="20"/>
-              </w:rPr>
-              <w:t xml:space="preserve">2024 % [95% CI]</w:t>
-            </w:r>
-          </w:p>
-        </w:tc>
-        <w:tc>
-          <w:tcPr>
-            <w:tcW w:type="dxa" w:w="2400"/>
-            <w:tcBorders>
-              <w:top w:val="single" w:color="000000" w:sz="1"/>
-              <w:left w:val="single" w:color="000000" w:sz="1"/>
-              <w:bottom w:val="single" w:color="000000" w:sz="1"/>
-              <w:right w:val="single" w:color="000000" w:sz="1"/>
-            </w:tcBorders>
-            <w:tcMar>
-              <w:top w:type="dxa" w:w="40"/>
-              <w:left w:type="dxa" w:w="90"/>
-              <w:bottom w:type="dxa" w:w="40"/>
-              <w:right w:type="dxa" w:w="90"/>
-            </w:tcMar>
-          </w:tcPr>
-          <w:p>
-            <w:pPr>
-              <w:spacing w:line="240"/>
-            </w:pPr>
-            <w:r>
-              <w:rPr>
-                <w:rFonts w:ascii="Times New Roman" w:cs="Times New Roman" w:eastAsia="Times New Roman" w:hAnsi="Times New Roman"/>
-                <w:b/>
-                <w:bCs/>
-                <w:sz w:val="20"/>
-                <w:szCs w:val="20"/>
-              </w:rPr>
-              <w:t xml:space="preserve">Trend %/yr [95% CI]</w:t>
-            </w:r>
-          </w:p>
-        </w:tc>
-      </w:tr>
-      <w:tr>
-        <w:tc>
-          <w:tcPr>
-            <w:tcW w:type="dxa" w:w="4560"/>
-            <w:tcBorders>
-              <w:top w:val="single" w:color="000000" w:sz="1"/>
-              <w:left w:val="single" w:color="000000" w:sz="1"/>
-              <w:bottom w:val="single" w:color="000000" w:sz="1"/>
-              <w:right w:val="single" w:color="000000" w:sz="1"/>
-            </w:tcBorders>
-            <w:tcMar>
-              <w:top w:type="dxa" w:w="40"/>
-              <w:left w:type="dxa" w:w="90"/>
-              <w:bottom w:type="dxa" w:w="40"/>
-              <w:right w:type="dxa" w:w="90"/>
-            </w:tcMar>
-          </w:tcPr>
-          <w:p>
-            <w:pPr>
-              <w:spacing w:line="240"/>
-            </w:pPr>
-            <w:r>
-              <w:rPr>
-                <w:rFonts w:ascii="Times New Roman" w:cs="Times New Roman" w:eastAsia="Times New Roman" w:hAnsi="Times New Roman"/>
-                <w:b w:val="false"/>
-                <w:bCs w:val="false"/>
-                <w:sz w:val="20"/>
-                <w:szCs w:val="20"/>
-              </w:rPr>
-              <w:t xml:space="preserve">Stand age &gt;= 120 yr</w:t>
-            </w:r>
-          </w:p>
-        </w:tc>
-        <w:tc>
-          <w:tcPr>
-            <w:tcW w:type="dxa" w:w="2400"/>
-            <w:tcBorders>
-              <w:top w:val="single" w:color="000000" w:sz="1"/>
-              <w:left w:val="single" w:color="000000" w:sz="1"/>
-              <w:bottom w:val="single" w:color="000000" w:sz="1"/>
-              <w:right w:val="single" w:color="000000" w:sz="1"/>
-            </w:tcBorders>
-            <w:tcMar>
-              <w:top w:type="dxa" w:w="40"/>
-              <w:left w:type="dxa" w:w="90"/>
-              <w:bottom w:type="dxa" w:w="40"/>
-              <w:right w:type="dxa" w:w="90"/>
-            </w:tcMar>
-          </w:tcPr>
-          <w:p>
-            <w:pPr>
-              <w:spacing w:line="240"/>
-            </w:pPr>
-            <w:r>
-              <w:rPr>
-                <w:rFonts w:ascii="Times New Roman" w:cs="Times New Roman" w:eastAsia="Times New Roman" w:hAnsi="Times New Roman"/>
-                <w:b w:val="false"/>
-                <w:bCs w:val="false"/>
-                <w:sz w:val="20"/>
-                <w:szCs w:val="20"/>
-              </w:rPr>
-              <w:t xml:space="preserve">3.9 [3.3, 4.6]</w:t>
-            </w:r>
-          </w:p>
-        </w:tc>
-        <w:tc>
-          <w:tcPr>
-            <w:tcW w:type="dxa" w:w="2400"/>
-            <w:tcBorders>
-              <w:top w:val="single" w:color="000000" w:sz="1"/>
-              <w:left w:val="single" w:color="000000" w:sz="1"/>
-              <w:bottom w:val="single" w:color="000000" w:sz="1"/>
-              <w:right w:val="single" w:color="000000" w:sz="1"/>
-            </w:tcBorders>
-            <w:tcMar>
-              <w:top w:type="dxa" w:w="40"/>
-              <w:left w:type="dxa" w:w="90"/>
-              <w:bottom w:type="dxa" w:w="40"/>
-              <w:right w:type="dxa" w:w="90"/>
-            </w:tcMar>
-          </w:tcPr>
-          <w:p>
-            <w:pPr>
-              <w:spacing w:line="240"/>
-            </w:pPr>
-            <w:r>
-              <w:rPr>
-                <w:rFonts w:ascii="Times New Roman" w:cs="Times New Roman" w:eastAsia="Times New Roman" w:hAnsi="Times New Roman"/>
-                <w:b w:val="false"/>
-                <w:bCs w:val="false"/>
-                <w:sz w:val="20"/>
-                <w:szCs w:val="20"/>
-              </w:rPr>
-              <w:t xml:space="preserve">+0.065 [0.054, 0.075]</w:t>
-            </w:r>
-          </w:p>
-        </w:tc>
-      </w:tr>
-      <w:tr>
-        <w:tc>
-          <w:tcPr>
-            <w:tcW w:type="dxa" w:w="4560"/>
-            <w:tcBorders>
-              <w:top w:val="single" w:color="000000" w:sz="1"/>
-              <w:left w:val="single" w:color="000000" w:sz="1"/>
-              <w:bottom w:val="single" w:color="000000" w:sz="1"/>
-              <w:right w:val="single" w:color="000000" w:sz="1"/>
-            </w:tcBorders>
-            <w:tcMar>
-              <w:top w:type="dxa" w:w="40"/>
-              <w:left w:type="dxa" w:w="90"/>
-              <w:bottom w:type="dxa" w:w="40"/>
-              <w:right w:type="dxa" w:w="90"/>
-            </w:tcMar>
-          </w:tcPr>
-          <w:p>
-            <w:pPr>
-              <w:spacing w:line="240"/>
-            </w:pPr>
-            <w:r>
-              <w:rPr>
-                <w:rFonts w:ascii="Times New Roman" w:cs="Times New Roman" w:eastAsia="Times New Roman" w:hAnsi="Times New Roman"/>
-                <w:b w:val="false"/>
-                <w:bCs w:val="false"/>
-                <w:sz w:val="20"/>
-                <w:szCs w:val="20"/>
-              </w:rPr>
-              <w:t xml:space="preserve">Large-tree basal area &gt;= 30 ft-squared/ac</w:t>
-            </w:r>
-          </w:p>
-        </w:tc>
-        <w:tc>
-          <w:tcPr>
-            <w:tcW w:type="dxa" w:w="2400"/>
-            <w:tcBorders>
-              <w:top w:val="single" w:color="000000" w:sz="1"/>
-              <w:left w:val="single" w:color="000000" w:sz="1"/>
-              <w:bottom w:val="single" w:color="000000" w:sz="1"/>
-              <w:right w:val="single" w:color="000000" w:sz="1"/>
-            </w:tcBorders>
-            <w:tcMar>
-              <w:top w:type="dxa" w:w="40"/>
-              <w:left w:type="dxa" w:w="90"/>
-              <w:bottom w:type="dxa" w:w="40"/>
-              <w:right w:type="dxa" w:w="90"/>
-            </w:tcMar>
-          </w:tcPr>
-          <w:p>
-            <w:pPr>
-              <w:spacing w:line="240"/>
-            </w:pPr>
-            <w:r>
-              <w:rPr>
-                <w:rFonts w:ascii="Times New Roman" w:cs="Times New Roman" w:eastAsia="Times New Roman" w:hAnsi="Times New Roman"/>
-                <w:b w:val="false"/>
-                <w:bCs w:val="false"/>
-                <w:sz w:val="20"/>
-                <w:szCs w:val="20"/>
-              </w:rPr>
-              <w:t xml:space="preserve">12.5 [11.4, 13.7]</w:t>
-            </w:r>
-          </w:p>
-        </w:tc>
-        <w:tc>
-          <w:tcPr>
-            <w:tcW w:type="dxa" w:w="2400"/>
-            <w:tcBorders>
-              <w:top w:val="single" w:color="000000" w:sz="1"/>
-              <w:left w:val="single" w:color="000000" w:sz="1"/>
-              <w:bottom w:val="single" w:color="000000" w:sz="1"/>
-              <w:right w:val="single" w:color="000000" w:sz="1"/>
-            </w:tcBorders>
-            <w:tcMar>
-              <w:top w:type="dxa" w:w="40"/>
-              <w:left w:type="dxa" w:w="90"/>
-              <w:bottom w:type="dxa" w:w="40"/>
-              <w:right w:type="dxa" w:w="90"/>
-            </w:tcMar>
-          </w:tcPr>
-          <w:p>
-            <w:pPr>
-              <w:spacing w:line="240"/>
-            </w:pPr>
-            <w:r>
-              <w:rPr>
-                <w:rFonts w:ascii="Times New Roman" w:cs="Times New Roman" w:eastAsia="Times New Roman" w:hAnsi="Times New Roman"/>
-                <w:b w:val="false"/>
-                <w:bCs w:val="false"/>
-                <w:sz w:val="20"/>
-                <w:szCs w:val="20"/>
-              </w:rPr>
-              <w:t xml:space="preserve">+0.17 [0.15, 0.18]</w:t>
-            </w:r>
-          </w:p>
-        </w:tc>
-      </w:tr>
-    </w:tbl>
-    <w:p>
       <w:r>
         <w:br w:type="page"/>
       </w:r>
@@ -1892,7 +1628,49 @@
           <w:sz w:val="24"/>
           <w:szCs w:val="24"/>
         </w:rPr>
-        <w:t xml:space="preserve">Fig. 2. A repeatable four-axis classification of true LSOG, FIA design-based for Maine. (a) The class narrows from 96% of forestland meeting one axis to 6.5% meeting all four (true LSOG). (b) Each axis alone; live structure (large trees) is scarcest. Error bars are 95% confidence intervals.</w:t>
+        <w:t xml:space="preserve">Fig. 2. How much LSOG is in Maine? Estimates for the same forest under different methods and definitions, spanning about 4% to 22% (a 5.6-fold range). Design-based FIA estimates and the four-axis true-LSOG estimate carry 95% confidence intervals; remote-sensing class areas do not. The open diamond marks the authors' reported 19.7%.</w:t>
+      </w:r>
+    </w:p>
+    <w:p>
+      <w:pPr>
+        <w:spacing w:after="0" w:line="480"/>
+        <w:jc w:val="left"/>
+      </w:pPr>
+      <w:r>
+        <w:rPr>
+          <w:rFonts w:ascii="Times New Roman" w:cs="Times New Roman" w:eastAsia="Times New Roman" w:hAnsi="Times New Roman"/>
+          <w:sz w:val="24"/>
+          <w:szCs w:val="24"/>
+        </w:rPr>
+        <w:t xml:space="preserve">Fig. 3. FIA design-based older forest in Maine over 2003-2024 by three measures: stand age &gt;= 120 yr, large-tree basal area, and the TreeMap-imputed LSOG class, each with a 95% band. All increase; the structural and classification measures do not depend on modeled age.</w:t>
+      </w:r>
+    </w:p>
+    <w:p>
+      <w:pPr>
+        <w:spacing w:after="0" w:line="480"/>
+        <w:jc w:val="left"/>
+      </w:pPr>
+      <w:r>
+        <w:rPr>
+          <w:rFonts w:ascii="Times New Roman" w:cs="Times New Roman" w:eastAsia="Times New Roman" w:hAnsi="Times New Roman"/>
+          <w:sz w:val="24"/>
+          <w:szCs w:val="24"/>
+        </w:rPr>
+        <w:t xml:space="preserve">Fig. 4. A repeatable four-axis classification of true LSOG, FIA design-based for Maine. (a) The class narrows from 96% of forestland meeting one axis to 6.5% meeting all four (true LSOG). (b) Each axis alone; live structure (large trees) is scarcest. Error bars are 95% confidence intervals.</w:t>
+      </w:r>
+    </w:p>
+    <w:p>
+      <w:pPr>
+        <w:spacing w:after="0" w:line="480"/>
+        <w:jc w:val="left"/>
+      </w:pPr>
+      <w:r>
+        <w:rPr>
+          <w:rFonts w:ascii="Times New Roman" w:cs="Times New Roman" w:eastAsia="Times New Roman" w:hAnsi="Times New Roman"/>
+          <w:sz w:val="24"/>
+          <w:szCs w:val="24"/>
+        </w:rPr>
+        <w:t xml:space="preserve">Fig. 5. Where mapped LSOG sits, by tercile of three landscape drivers (n = 3.8 million pixels): (a) modeled annual harvest probability, (b) slope (a cost-and-logistics constraint), and (c) disturbance probability. Mapped LSOG rises with all three: more merchantable, yet on more constrained terrain.</w:t>
       </w:r>
     </w:p>
     <w:p>
@@ -1989,7 +1767,7 @@
       <w:r>
         <w:drawing>
           <wp:inline distT="0" distB="0" distL="0" distR="0">
-            <wp:extent cx="4095750" cy="4467225"/>
+            <wp:extent cx="5257800" cy="2733675"/>
             <wp:effectExtent t="0" r="0" b="0" l="0"/>
             <wp:docPr id="1" name="Fig. 2 (supplied as separate 300-dpi TIFF: WeiskittelComment_Fig2.tif)." descr="Fig. 2 (supplied as separate 300-dpi TIFF: WeiskittelComment_Fig2.tif)." title="Fig. 2 (supplied as separate 300-dpi TIFF: WeiskittelComment_Fig2.tif)."/>
             <wp:cNvGraphicFramePr>
@@ -2014,7 +1792,205 @@
                   <pic:spPr bwMode="auto">
                     <a:xfrm>
                       <a:off x="0" y="0"/>
+                      <a:ext cx="5257800" cy="2733675"/>
+                    </a:xfrm>
+                    <a:prstGeom prst="rect">
+                      <a:avLst/>
+                    </a:prstGeom>
+                  </pic:spPr>
+                </pic:pic>
+              </a:graphicData>
+            </a:graphic>
+          </wp:inline>
+        </w:drawing>
+      </w:r>
+    </w:p>
+    <w:p>
+      <w:r>
+        <w:br w:type="page"/>
+      </w:r>
+    </w:p>
+    <w:p>
+      <w:pPr>
+        <w:spacing w:line="240"/>
+      </w:pPr>
+      <w:r>
+        <w:rPr>
+          <w:rFonts w:ascii="Times New Roman" w:cs="Times New Roman" w:eastAsia="Times New Roman" w:hAnsi="Times New Roman"/>
+          <w:i/>
+          <w:iCs/>
+          <w:sz w:val="20"/>
+          <w:szCs w:val="20"/>
+        </w:rPr>
+        <w:t xml:space="preserve">Fig. 3 (supplied as separate 300-dpi TIFF: WeiskittelComment_Fig3.tif).</w:t>
+      </w:r>
+    </w:p>
+    <w:p>
+      <w:pPr>
+        <w:spacing w:before="60"/>
+        <w:jc w:val="center"/>
+      </w:pPr>
+      <w:r>
+        <w:drawing>
+          <wp:inline distT="0" distB="0" distL="0" distR="0">
+            <wp:extent cx="3143250" cy="5076825"/>
+            <wp:effectExtent t="0" r="0" b="0" l="0"/>
+            <wp:docPr id="1" name="Fig. 3 (supplied as separate 300-dpi TIFF: WeiskittelComment_Fig3.tif)." descr="Fig. 3 (supplied as separate 300-dpi TIFF: WeiskittelComment_Fig3.tif)." title="Fig. 3 (supplied as separate 300-dpi TIFF: WeiskittelComment_Fig3.tif)."/>
+            <wp:cNvGraphicFramePr>
+              <a:graphicFrameLocks xmlns:a="http://schemas.openxmlformats.org/drawingml/2006/main" noChangeAspect="1"/>
+            </wp:cNvGraphicFramePr>
+            <a:graphic xmlns:a="http://schemas.openxmlformats.org/drawingml/2006/main">
+              <a:graphicData uri="http://schemas.openxmlformats.org/drawingml/2006/picture">
+                <pic:pic xmlns:pic="http://schemas.openxmlformats.org/drawingml/2006/picture">
+                  <pic:nvPicPr>
+                    <pic:cNvPr id="0" name="" descr=""/>
+                    <pic:cNvPicPr>
+                      <a:picLocks noChangeAspect="1" noChangeArrowheads="1"/>
+                    </pic:cNvPicPr>
+                  </pic:nvPicPr>
+                  <pic:blipFill>
+                    <a:blip r:embed="rId9" cstate="none"/>
+                    <a:srcRect/>
+                    <a:stretch>
+                      <a:fillRect/>
+                    </a:stretch>
+                  </pic:blipFill>
+                  <pic:spPr bwMode="auto">
+                    <a:xfrm>
+                      <a:off x="0" y="0"/>
+                      <a:ext cx="3143250" cy="5076825"/>
+                    </a:xfrm>
+                    <a:prstGeom prst="rect">
+                      <a:avLst/>
+                    </a:prstGeom>
+                  </pic:spPr>
+                </pic:pic>
+              </a:graphicData>
+            </a:graphic>
+          </wp:inline>
+        </w:drawing>
+      </w:r>
+    </w:p>
+    <w:p>
+      <w:r>
+        <w:br w:type="page"/>
+      </w:r>
+    </w:p>
+    <w:p>
+      <w:pPr>
+        <w:spacing w:line="240"/>
+      </w:pPr>
+      <w:r>
+        <w:rPr>
+          <w:rFonts w:ascii="Times New Roman" w:cs="Times New Roman" w:eastAsia="Times New Roman" w:hAnsi="Times New Roman"/>
+          <w:i/>
+          <w:iCs/>
+          <w:sz w:val="20"/>
+          <w:szCs w:val="20"/>
+        </w:rPr>
+        <w:t xml:space="preserve">Fig. 4 (supplied as separate 300-dpi TIFF: WeiskittelComment_Fig4.tif).</w:t>
+      </w:r>
+    </w:p>
+    <w:p>
+      <w:pPr>
+        <w:spacing w:before="60"/>
+        <w:jc w:val="center"/>
+      </w:pPr>
+      <w:r>
+        <w:drawing>
+          <wp:inline distT="0" distB="0" distL="0" distR="0">
+            <wp:extent cx="4095750" cy="4467225"/>
+            <wp:effectExtent t="0" r="0" b="0" l="0"/>
+            <wp:docPr id="1" name="Fig. 4 (supplied as separate 300-dpi TIFF: WeiskittelComment_Fig4.tif)." descr="Fig. 4 (supplied as separate 300-dpi TIFF: WeiskittelComment_Fig4.tif)." title="Fig. 4 (supplied as separate 300-dpi TIFF: WeiskittelComment_Fig4.tif)."/>
+            <wp:cNvGraphicFramePr>
+              <a:graphicFrameLocks xmlns:a="http://schemas.openxmlformats.org/drawingml/2006/main" noChangeAspect="1"/>
+            </wp:cNvGraphicFramePr>
+            <a:graphic xmlns:a="http://schemas.openxmlformats.org/drawingml/2006/main">
+              <a:graphicData uri="http://schemas.openxmlformats.org/drawingml/2006/picture">
+                <pic:pic xmlns:pic="http://schemas.openxmlformats.org/drawingml/2006/picture">
+                  <pic:nvPicPr>
+                    <pic:cNvPr id="0" name="" descr=""/>
+                    <pic:cNvPicPr>
+                      <a:picLocks noChangeAspect="1" noChangeArrowheads="1"/>
+                    </pic:cNvPicPr>
+                  </pic:nvPicPr>
+                  <pic:blipFill>
+                    <a:blip r:embed="rId10" cstate="none"/>
+                    <a:srcRect/>
+                    <a:stretch>
+                      <a:fillRect/>
+                    </a:stretch>
+                  </pic:blipFill>
+                  <pic:spPr bwMode="auto">
+                    <a:xfrm>
+                      <a:off x="0" y="0"/>
                       <a:ext cx="4095750" cy="4467225"/>
+                    </a:xfrm>
+                    <a:prstGeom prst="rect">
+                      <a:avLst/>
+                    </a:prstGeom>
+                  </pic:spPr>
+                </pic:pic>
+              </a:graphicData>
+            </a:graphic>
+          </wp:inline>
+        </w:drawing>
+      </w:r>
+    </w:p>
+    <w:p>
+      <w:r>
+        <w:br w:type="page"/>
+      </w:r>
+    </w:p>
+    <w:p>
+      <w:pPr>
+        <w:spacing w:line="240"/>
+      </w:pPr>
+      <w:r>
+        <w:rPr>
+          <w:rFonts w:ascii="Times New Roman" w:cs="Times New Roman" w:eastAsia="Times New Roman" w:hAnsi="Times New Roman"/>
+          <w:i/>
+          <w:iCs/>
+          <w:sz w:val="20"/>
+          <w:szCs w:val="20"/>
+        </w:rPr>
+        <w:t xml:space="preserve">Fig. 5 (supplied as separate 300-dpi TIFF: WeiskittelComment_Fig5.tif).</w:t>
+      </w:r>
+    </w:p>
+    <w:p>
+      <w:pPr>
+        <w:spacing w:before="60"/>
+        <w:jc w:val="center"/>
+      </w:pPr>
+      <w:r>
+        <w:drawing>
+          <wp:inline distT="0" distB="0" distL="0" distR="0">
+            <wp:extent cx="5257800" cy="2124075"/>
+            <wp:effectExtent t="0" r="0" b="0" l="0"/>
+            <wp:docPr id="1" name="Fig. 5 (supplied as separate 300-dpi TIFF: WeiskittelComment_Fig5.tif)." descr="Fig. 5 (supplied as separate 300-dpi TIFF: WeiskittelComment_Fig5.tif)." title="Fig. 5 (supplied as separate 300-dpi TIFF: WeiskittelComment_Fig5.tif)."/>
+            <wp:cNvGraphicFramePr>
+              <a:graphicFrameLocks xmlns:a="http://schemas.openxmlformats.org/drawingml/2006/main" noChangeAspect="1"/>
+            </wp:cNvGraphicFramePr>
+            <a:graphic xmlns:a="http://schemas.openxmlformats.org/drawingml/2006/main">
+              <a:graphicData uri="http://schemas.openxmlformats.org/drawingml/2006/picture">
+                <pic:pic xmlns:pic="http://schemas.openxmlformats.org/drawingml/2006/picture">
+                  <pic:nvPicPr>
+                    <pic:cNvPr id="0" name="" descr=""/>
+                    <pic:cNvPicPr>
+                      <a:picLocks noChangeAspect="1" noChangeArrowheads="1"/>
+                    </pic:cNvPicPr>
+                  </pic:nvPicPr>
+                  <pic:blipFill>
+                    <a:blip r:embed="rId11" cstate="none"/>
+                    <a:srcRect/>
+                    <a:stretch>
+                      <a:fillRect/>
+                    </a:stretch>
+                  </pic:blipFill>
+                  <pic:spPr bwMode="auto">
+                    <a:xfrm>
+                      <a:off x="0" y="0"/>
+                      <a:ext cx="5257800" cy="2124075"/>
                     </a:xfrm>
                     <a:prstGeom prst="rect">
                       <a:avLst/>

</xml_diff>